<commit_message>
docs: agregar guia de presentacion del proyecto
Documento de apoyo para la revision: que hace cada capa, como se maneja el estado, como se guarda la informacion en el telefono, las decisiones de diseno y el por que de cada una, un guion de prueba de tres minutos, las preguntas que puede hacer el profesor con su respuesta y un glosario de los terminos usados. Tambien se corrige el formato del documento de estructura.
</commit_message>
<xml_diff>
--- a/docs/ESTRUCTURA.docx
+++ b/docs/ESTRUCTURA.docx
@@ -19,7 +19,7 @@
     <w:p>
       <w:pPr>
         <w:shd w:val="clear" w:color="auto" w:fill="EEF7F6"/>
-        <w:divId w:val="1332023355"/>
+        <w:divId w:val="340396066"/>
         <w:rPr>
           <w:rFonts w:ascii="Calibri" w:eastAsia="Times New Roman" w:hAnsi="Calibri" w:cs="Calibri"/>
           <w:color w:val="223344"/>
@@ -40,7 +40,7 @@
     <w:p>
       <w:pPr>
         <w:shd w:val="clear" w:color="auto" w:fill="EEF7F6"/>
-        <w:divId w:val="1193609886"/>
+        <w:divId w:val="2138404067"/>
         <w:rPr>
           <w:rFonts w:ascii="Calibri" w:eastAsia="Times New Roman" w:hAnsi="Calibri" w:cs="Calibri"/>
           <w:color w:val="223344"/>
@@ -75,7 +75,7 @@
           <w:sz w:val="22"/>
           <w:szCs w:val="22"/>
         </w:rPr>
-        <w:pict w14:anchorId="444896CF">
+        <w:pict>
           <v:rect id="_x0000_i1025" style="width:0;height:1.5pt" o:hralign="center" o:hrstd="t" o:hr="t" fillcolor="#a0a0a0" stroked="f"/>
         </w:pict>
       </w:r>
@@ -111,7 +111,7 @@
           <w:sz w:val="22"/>
           <w:szCs w:val="22"/>
         </w:rPr>
-        <w:t xml:space="preserve">El proyecto está ordenado en cuatro carpetas. Cada una tiene un trabajo distinto: </w:t>
+        <w:t>El proyecto está ordenado en cuatro carpetas. Cada una tiene un trabajo distinto:</w:t>
       </w:r>
     </w:p>
     <w:tbl>
@@ -824,7 +824,7 @@
           <w:sz w:val="22"/>
           <w:szCs w:val="22"/>
         </w:rPr>
-        <w:t xml:space="preserve">. Así nadie se enreda. </w:t>
+        <w:t>. Así nadie se enreda.</w:t>
       </w:r>
     </w:p>
     <w:p>
@@ -844,7 +844,7 @@
           <w:sz w:val="22"/>
           <w:szCs w:val="22"/>
         </w:rPr>
-        <w:pict w14:anchorId="2FCE49B5">
+        <w:pict>
           <v:rect id="_x0000_i1026" style="width:0;height:1.5pt" o:hralign="center" o:hrstd="t" o:hr="t" fillcolor="#a0a0a0" stroked="f"/>
         </w:pict>
       </w:r>
@@ -2076,7 +2076,7 @@
           <w:sz w:val="22"/>
           <w:szCs w:val="22"/>
         </w:rPr>
-        <w:pict w14:anchorId="17EE7BAC">
+        <w:pict>
           <v:rect id="_x0000_i1027" style="width:0;height:1.5pt" o:hralign="center" o:hrstd="t" o:hr="t" fillcolor="#a0a0a0" stroked="f"/>
         </w:pict>
       </w:r>
@@ -2662,7 +2662,7 @@
           <w:sz w:val="22"/>
           <w:szCs w:val="22"/>
         </w:rPr>
-        <w:pict w14:anchorId="330B43EF">
+        <w:pict>
           <v:rect id="_x0000_i1028" style="width:0;height:1.5pt" o:hralign="center" o:hrstd="t" o:hr="t" fillcolor="#a0a0a0" stroked="f"/>
         </w:pict>
       </w:r>
@@ -2754,7 +2754,7 @@
           <w:sz w:val="22"/>
           <w:szCs w:val="22"/>
         </w:rPr>
-        <w:t xml:space="preserve"> (qué pasa cuando el usuario toca algo). </w:t>
+        <w:t xml:space="preserve"> (qué pasa cuando el usuario toca algo).</w:t>
       </w:r>
     </w:p>
     <w:p>
@@ -4802,7 +4802,7 @@
           <w:sz w:val="22"/>
           <w:szCs w:val="22"/>
         </w:rPr>
-        <w:pict w14:anchorId="523A087B">
+        <w:pict>
           <v:rect id="_x0000_i1029" style="width:0;height:1.5pt" o:hralign="center" o:hrstd="t" o:hr="t" fillcolor="#a0a0a0" stroked="f"/>
         </w:pict>
       </w:r>
@@ -6810,7 +6810,7 @@
           <w:sz w:val="22"/>
           <w:szCs w:val="22"/>
         </w:rPr>
-        <w:pict w14:anchorId="17643CAA">
+        <w:pict>
           <v:rect id="_x0000_i1030" style="width:0;height:1.5pt" o:hralign="center" o:hrstd="t" o:hr="t" fillcolor="#a0a0a0" stroked="f"/>
         </w:pict>
       </w:r>
@@ -7126,7 +7126,7 @@
           <w:sz w:val="22"/>
           <w:szCs w:val="22"/>
         </w:rPr>
-        <w:pict w14:anchorId="7B780166">
+        <w:pict>
           <v:rect id="_x0000_i1031" style="width:0;height:1.5pt" o:hralign="center" o:hrstd="t" o:hr="t" fillcolor="#a0a0a0" stroked="f"/>
         </w:pict>
       </w:r>
@@ -7165,15 +7165,6 @@
         </w:rPr>
         <w:t>El usuario escribe un comentario en un ticket:</w:t>
       </w:r>
-      <w:r>
-        <w:rPr>
-          <w:rFonts w:ascii="Calibri" w:hAnsi="Calibri" w:cs="Calibri"/>
-          <w:color w:val="1A1A1A"/>
-          <w:sz w:val="22"/>
-          <w:szCs w:val="22"/>
-        </w:rPr>
-        <w:t xml:space="preserve"> </w:t>
-      </w:r>
     </w:p>
     <w:p>
       <w:pPr>
@@ -7227,7 +7218,7 @@
           <w:sz w:val="22"/>
           <w:szCs w:val="22"/>
         </w:rPr>
-        <w:t xml:space="preserve"> hacia arriba. </w:t>
+        <w:t xml:space="preserve"> </w:t>
       </w:r>
       <w:r>
         <w:rPr>
@@ -7236,7 +7227,7 @@
           <w:sz w:val="22"/>
           <w:szCs w:val="22"/>
         </w:rPr>
-        <w:t>2. El ViewModel (</w:t>
+        <w:t>hacia arriba. 2. El ViewModel (</w:t>
       </w:r>
       <w:r>
         <w:rPr>
@@ -7363,7 +7354,7 @@
           <w:sz w:val="22"/>
           <w:szCs w:val="22"/>
         </w:rPr>
-        <w:t xml:space="preserve"> sola con el comentario nuevo. </w:t>
+        <w:t xml:space="preserve"> sola con el comentario nuevo.</w:t>
       </w:r>
     </w:p>
     <w:p>
@@ -7418,7 +7409,7 @@
           <w:sz w:val="22"/>
           <w:szCs w:val="22"/>
         </w:rPr>
-        <w:t xml:space="preserve"> y siguen vivas. </w:t>
+        <w:t xml:space="preserve"> y siguen vivas.</w:t>
       </w:r>
     </w:p>
     <w:p>
@@ -7441,15 +7432,6 @@
         </w:rPr>
         <w:t>El usuario cambia el modo de color en Ajustes:</w:t>
       </w:r>
-      <w:r>
-        <w:rPr>
-          <w:rFonts w:ascii="Calibri" w:hAnsi="Calibri" w:cs="Calibri"/>
-          <w:color w:val="1A1A1A"/>
-          <w:sz w:val="22"/>
-          <w:szCs w:val="22"/>
-        </w:rPr>
-        <w:t xml:space="preserve"> </w:t>
-      </w:r>
     </w:p>
     <w:p>
       <w:pPr>
@@ -7595,7 +7577,7 @@
           <w:sz w:val="22"/>
           <w:szCs w:val="22"/>
         </w:rPr>
-        <w:t xml:space="preserve"> a la vez, sin que nadie se lo ordene. </w:t>
+        <w:t xml:space="preserve"> a la vez, sin que nadie se lo ordene.</w:t>
       </w:r>
     </w:p>
     <w:p>
@@ -7615,7 +7597,7 @@
           <w:sz w:val="22"/>
           <w:szCs w:val="22"/>
         </w:rPr>
-        <w:pict w14:anchorId="45DA965F">
+        <w:pict>
           <v:rect id="_x0000_i1032" style="width:0;height:1.5pt" o:hralign="center" o:hrstd="t" o:hr="t" fillcolor="#a0a0a0" stroked="f"/>
         </w:pict>
       </w:r>
@@ -8541,7 +8523,7 @@
           <w:sz w:val="22"/>
           <w:szCs w:val="22"/>
         </w:rPr>
-        <w:t xml:space="preserve"> para las listas de tickets y usuarios, que tienen datos relacionados entre sí, y DataStore para las preferencias sueltas, que son valores simples. </w:t>
+        <w:t xml:space="preserve"> para las listas de tickets y usuarios, que tienen datos relacionados entre sí, y DataStore para las preferencias sueltas, que son valores simples.</w:t>
       </w:r>
     </w:p>
     <w:p>
@@ -8561,7 +8543,7 @@
           <w:sz w:val="22"/>
           <w:szCs w:val="22"/>
         </w:rPr>
-        <w:pict w14:anchorId="6DC79F23">
+        <w:pict>
           <v:rect id="_x0000_i1033" style="width:0;height:1.5pt" o:hralign="center" o:hrstd="t" o:hr="t" fillcolor="#a0a0a0" stroked="f"/>
         </w:pict>
       </w:r>
@@ -8775,7 +8757,16 @@
           <w:sz w:val="22"/>
           <w:szCs w:val="22"/>
         </w:rPr>
-        <w:t xml:space="preserve"> de ejemplo que cubren todos los estados y prioridades.</w:t>
+        <w:t xml:space="preserve"> </w:t>
+      </w:r>
+      <w:r>
+        <w:rPr>
+          <w:rFonts w:ascii="Calibri" w:eastAsia="Times New Roman" w:hAnsi="Calibri" w:cs="Calibri"/>
+          <w:color w:val="1A1A1A"/>
+          <w:sz w:val="22"/>
+          <w:szCs w:val="22"/>
+        </w:rPr>
+        <w:t>de ejemplo que cubren todos los estados y prioridades.</w:t>
       </w:r>
     </w:p>
     <w:p>
@@ -8878,7 +8869,7 @@
           <w:sz w:val="22"/>
           <w:szCs w:val="22"/>
         </w:rPr>
-        <w:t xml:space="preserve">. </w:t>
+        <w:t>.</w:t>
       </w:r>
     </w:p>
     <w:p>
@@ -8961,9 +8952,9 @@
 <file path=word/numbering.xml><?xml version="1.0" encoding="utf-8"?>
 <w:numbering xmlns:wpc="http://schemas.microsoft.com/office/word/2010/wordprocessingCanvas" xmlns:cx="http://schemas.microsoft.com/office/drawing/2014/chartex" xmlns:cx1="http://schemas.microsoft.com/office/drawing/2015/9/8/chartex" xmlns:cx2="http://schemas.microsoft.com/office/drawing/2015/10/21/chartex" xmlns:cx3="http://schemas.microsoft.com/office/drawing/2016/5/9/chartex" xmlns:cx4="http://schemas.microsoft.com/office/drawing/2016/5/10/chartex" xmlns:cx5="http://schemas.microsoft.com/office/drawing/2016/5/11/chartex" xmlns:cx6="http://schemas.microsoft.com/office/drawing/2016/5/12/chartex" xmlns:cx7="http://schemas.microsoft.com/office/drawing/2016/5/13/chartex" xmlns:cx8="http://schemas.microsoft.com/office/drawing/2016/5/14/chartex" xmlns:mc="http://schemas.openxmlformats.org/markup-compatibility/2006" xmlns:aink="http://schemas.microsoft.com/office/drawing/2016/ink" xmlns:am3d="http://schemas.microsoft.com/office/drawing/2017/model3d" xmlns:o="urn:schemas-microsoft-com:office:office" xmlns:oel="http://schemas.microsoft.com/office/2019/extlst" xmlns:r="http://schemas.openxmlformats.org/officeDocument/2006/relationships" xmlns:m="http://schemas.openxmlformats.org/officeDocument/2006/math" xmlns:v="urn:schemas-microsoft-com:vml" xmlns:wp14="http://schemas.microsoft.com/office/word/2010/wordprocessingDrawing" xmlns:wp="http://schemas.openxmlformats.org/drawingml/2006/wordprocessingDrawing" xmlns:w10="urn:schemas-microsoft-com:office:word" xmlns:w="http://schemas.openxmlformats.org/wordprocessingml/2006/main" xmlns:w14="http://schemas.microsoft.com/office/word/2010/wordml" xmlns:w15="http://schemas.microsoft.com/office/word/2012/wordml" xmlns:w16cex="http://schemas.microsoft.com/office/word/2018/wordml/cex" xmlns:w16cid="http://schemas.microsoft.com/office/word/2016/wordml/cid" xmlns:w16="http://schemas.microsoft.com/office/word/2018/wordml" xmlns:w16du="http://schemas.microsoft.com/office/word/2023/wordml/word16du" xmlns:w16sdtdh="http://schemas.microsoft.com/office/word/2020/wordml/sdtdatahash" xmlns:w16sdtfl="http://schemas.microsoft.com/office/word/2024/wordml/sdtformatlock" xmlns:w16se="http://schemas.microsoft.com/office/word/2015/wordml/symex" xmlns:wpg="http://schemas.microsoft.com/office/word/2010/wordprocessingGroup" xmlns:wpi="http://schemas.microsoft.com/office/word/2010/wordprocessingInk" xmlns:wne="http://schemas.microsoft.com/office/word/2006/wordml" xmlns:wps="http://schemas.microsoft.com/office/word/2010/wordprocessingShape" mc:Ignorable="w14 w15 w16se w16cid w16 w16cex w16sdtdh w16sdtfl w16du wp14">
   <w:abstractNum w:abstractNumId="0" w15:restartNumberingAfterBreak="0">
-    <w:nsid w:val="3F0025EF"/>
+    <w:nsid w:val="0FB673B5"/>
     <w:multiLevelType w:val="multilevel"/>
-    <w:tmpl w:val="F042A9CA"/>
+    <w:tmpl w:val="8872FF98"/>
     <w:lvl w:ilvl="0">
       <w:start w:val="1"/>
       <w:numFmt w:val="bullet"/>
@@ -9110,9 +9101,9 @@
     </w:lvl>
   </w:abstractNum>
   <w:abstractNum w:abstractNumId="1" w15:restartNumberingAfterBreak="0">
-    <w:nsid w:val="7F6E6864"/>
+    <w:nsid w:val="397D3C87"/>
     <w:multiLevelType w:val="multilevel"/>
-    <w:tmpl w:val="35685F74"/>
+    <w:tmpl w:val="9FE24FDE"/>
     <w:lvl w:ilvl="0">
       <w:start w:val="1"/>
       <w:numFmt w:val="bullet"/>
@@ -9258,10 +9249,10 @@
       </w:rPr>
     </w:lvl>
   </w:abstractNum>
-  <w:num w:numId="1" w16cid:durableId="607199987">
+  <w:num w:numId="1" w16cid:durableId="96410897">
     <w:abstractNumId w:val="0"/>
   </w:num>
-  <w:num w:numId="2" w16cid:durableId="913516763">
+  <w:num w:numId="2" w16cid:durableId="876939187">
     <w:abstractNumId w:val="1"/>
   </w:num>
 </w:numbering>
@@ -9801,11 +9792,59 @@
       <w:szCs w:val="28"/>
     </w:rPr>
   </w:style>
+  <w:style w:type="paragraph" w:styleId="HTMLconformatoprevio">
+    <w:name w:val="HTML Preformatted"/>
+    <w:basedOn w:val="Normal"/>
+    <w:link w:val="HTMLconformatoprevioCar"/>
+    <w:uiPriority w:val="99"/>
+    <w:semiHidden/>
+    <w:unhideWhenUsed/>
+    <w:pPr>
+      <w:pBdr>
+        <w:left w:val="single" w:sz="18" w:space="10" w:color="2E5AAC"/>
+      </w:pBdr>
+      <w:shd w:val="clear" w:color="auto" w:fill="F4F6FA"/>
+      <w:tabs>
+        <w:tab w:val="left" w:pos="916"/>
+        <w:tab w:val="left" w:pos="1832"/>
+        <w:tab w:val="left" w:pos="2748"/>
+        <w:tab w:val="left" w:pos="3664"/>
+        <w:tab w:val="left" w:pos="4580"/>
+        <w:tab w:val="left" w:pos="5496"/>
+        <w:tab w:val="left" w:pos="6412"/>
+        <w:tab w:val="left" w:pos="7328"/>
+        <w:tab w:val="left" w:pos="8244"/>
+        <w:tab w:val="left" w:pos="9160"/>
+        <w:tab w:val="left" w:pos="10076"/>
+        <w:tab w:val="left" w:pos="10992"/>
+        <w:tab w:val="left" w:pos="11908"/>
+        <w:tab w:val="left" w:pos="12824"/>
+        <w:tab w:val="left" w:pos="13740"/>
+        <w:tab w:val="left" w:pos="14656"/>
+      </w:tabs>
+      <w:spacing w:before="120" w:after="120"/>
+    </w:pPr>
+    <w:rPr>
+      <w:rFonts w:ascii="Courier New" w:hAnsi="Courier New" w:cs="Courier New"/>
+      <w:sz w:val="20"/>
+      <w:szCs w:val="20"/>
+    </w:rPr>
+  </w:style>
+  <w:style w:type="character" w:customStyle="1" w:styleId="HTMLconformatoprevioCar">
+    <w:name w:val="HTML con formato previo Car"/>
+    <w:basedOn w:val="Fuentedeprrafopredeter"/>
+    <w:link w:val="HTMLconformatoprevio"/>
+    <w:uiPriority w:val="99"/>
+    <w:semiHidden/>
+    <w:rPr>
+      <w:rFonts w:ascii="Consolas" w:eastAsiaTheme="minorEastAsia" w:hAnsi="Consolas"/>
+    </w:rPr>
+  </w:style>
   <w:style w:type="paragraph" w:customStyle="1" w:styleId="msonormal0">
     <w:name w:val="msonormal"/>
     <w:basedOn w:val="Normal"/>
     <w:pPr>
-      <w:spacing w:before="80" w:after="80"/>
+      <w:spacing w:before="100" w:after="100"/>
     </w:pPr>
   </w:style>
   <w:style w:type="paragraph" w:styleId="NormalWeb">
@@ -9815,7 +9854,7 @@
     <w:semiHidden/>
     <w:unhideWhenUsed/>
     <w:pPr>
-      <w:spacing w:before="80" w:after="80"/>
+      <w:spacing w:before="100" w:after="100"/>
     </w:pPr>
   </w:style>
   <w:style w:type="character" w:styleId="Fuerte">

</xml_diff>